<commit_message>
Add ML Using Python materials: reorganized assignments into subfolder, classroom notes with slides, Titanic notebook, and linear regression worksheets
</commit_message>
<xml_diff>
--- a/TYBCA/MachineLearningUsingPython/Introduction to Machine Learning.docx
+++ b/TYBCA/MachineLearningUsingPython/Introduction to Machine Learning.docx
@@ -1,6 +1,6 @@
 
 <file path=word/document.xml><?xml version="1.0" encoding="utf-8"?>
-<w:document xmlns:wpc="http://schemas.microsoft.com/office/word/2010/wordprocessingCanvas" xmlns:cx="http://schemas.microsoft.com/office/drawing/2014/chartex" xmlns:cx1="http://schemas.microsoft.com/office/drawing/2015/9/8/chartex" xmlns:cx2="http://schemas.microsoft.com/office/drawing/2015/10/21/chartex" xmlns:cx3="http://schemas.microsoft.com/office/drawing/2016/5/9/chartex" xmlns:cx4="http://schemas.microsoft.com/office/drawing/2016/5/10/chartex" xmlns:cx5="http://schemas.microsoft.com/office/drawing/2016/5/11/chartex" xmlns:cx6="http://schemas.microsoft.com/office/drawing/2016/5/12/chartex" xmlns:cx7="http://schemas.microsoft.com/office/drawing/2016/5/13/chartex" xmlns:cx8="http://schemas.microsoft.com/office/drawing/2016/5/14/chartex" xmlns:mc="http://schemas.openxmlformats.org/markup-compatibility/2006" xmlns:aink="http://schemas.microsoft.com/office/drawing/2016/ink" xmlns:am3d="http://schemas.microsoft.com/office/drawing/2017/model3d" xmlns:o="urn:schemas-microsoft-com:office:office" xmlns:oel="http://schemas.microsoft.com/office/2019/extlst" xmlns:r="http://schemas.openxmlformats.org/officeDocument/2006/relationships" xmlns:m="http://schemas.openxmlformats.org/officeDocument/2006/math" xmlns:v="urn:schemas-microsoft-com:vml" xmlns:wp14="http://schemas.microsoft.com/office/word/2010/wordprocessingDrawing" xmlns:wp="http://schemas.openxmlformats.org/drawingml/2006/wordprocessingDrawing" xmlns:w10="urn:schemas-microsoft-com:office:word" xmlns:w="http://schemas.openxmlformats.org/wordprocessingml/2006/main" xmlns:w14="http://schemas.microsoft.com/office/word/2010/wordml" xmlns:w15="http://schemas.microsoft.com/office/word/2012/wordml" xmlns:w16cei="http://schemas.microsoft.com/office/word/2026/wordml/cei" xmlns:w16cex="http://schemas.microsoft.com/office/word/2018/wordml/cex" xmlns:w16cid="http://schemas.microsoft.com/office/word/2016/wordml/cid" xmlns:w16="http://schemas.microsoft.com/office/word/2018/wordml" xmlns:w16du="http://schemas.microsoft.com/office/word/2023/wordml/word16du" xmlns:w16sdtdh="http://schemas.microsoft.com/office/word/2020/wordml/sdtdatahash" xmlns:w16sdtfl="http://schemas.microsoft.com/office/word/2024/wordml/sdtformatlock" xmlns:w16se="http://schemas.microsoft.com/office/word/2015/wordml/symex" xmlns:wpg="http://schemas.microsoft.com/office/word/2010/wordprocessingGroup" xmlns:wpi="http://schemas.microsoft.com/office/word/2010/wordprocessingInk" xmlns:wne="http://schemas.microsoft.com/office/word/2006/wordml" xmlns:wps="http://schemas.microsoft.com/office/word/2010/wordprocessingShape" mc:Ignorable="w14 w15 w16se w16cid w16 w16cex w16sdtdh w16sdtfl w16du wp14">
+<w:document xmlns:wpc="http://schemas.microsoft.com/office/word/2010/wordprocessingCanvas" xmlns:cx="http://schemas.microsoft.com/office/drawing/2014/chartex" xmlns:cx1="http://schemas.microsoft.com/office/drawing/2015/9/8/chartex" xmlns:cx2="http://schemas.microsoft.com/office/drawing/2015/10/21/chartex" xmlns:cx3="http://schemas.microsoft.com/office/drawing/2016/5/9/chartex" xmlns:cx4="http://schemas.microsoft.com/office/drawing/2016/5/10/chartex" xmlns:cx5="http://schemas.microsoft.com/office/drawing/2016/5/11/chartex" xmlns:cx6="http://schemas.microsoft.com/office/drawing/2016/5/12/chartex" xmlns:cx7="http://schemas.microsoft.com/office/drawing/2016/5/13/chartex" xmlns:cx8="http://schemas.microsoft.com/office/drawing/2016/5/14/chartex" xmlns:mc="http://schemas.openxmlformats.org/markup-compatibility/2006" xmlns:aink="http://schemas.microsoft.com/office/drawing/2016/ink" xmlns:am3d="http://schemas.microsoft.com/office/drawing/2017/model3d" xmlns:o="urn:schemas-microsoft-com:office:office" xmlns:oel="http://schemas.microsoft.com/office/2019/extlst" xmlns:r="http://schemas.openxmlformats.org/officeDocument/2006/relationships" xmlns:m="http://schemas.openxmlformats.org/officeDocument/2006/math" xmlns:v="urn:schemas-microsoft-com:vml" xmlns:wp14="http://schemas.microsoft.com/office/word/2010/wordprocessingDrawing" xmlns:wp="http://schemas.openxmlformats.org/drawingml/2006/wordprocessingDrawing" xmlns:w10="urn:schemas-microsoft-com:office:word" xmlns:w="http://schemas.openxmlformats.org/wordprocessingml/2006/main" xmlns:w14="http://schemas.microsoft.com/office/word/2010/wordml" xmlns:w15="http://schemas.microsoft.com/office/word/2012/wordml" xmlns:w16cex="http://schemas.microsoft.com/office/word/2018/wordml/cex" xmlns:w16cid="http://schemas.microsoft.com/office/word/2016/wordml/cid" xmlns:w16="http://schemas.microsoft.com/office/word/2018/wordml" xmlns:w16du="http://schemas.microsoft.com/office/word/2023/wordml/word16du" xmlns:w16sdtdh="http://schemas.microsoft.com/office/word/2020/wordml/sdtdatahash" xmlns:w16sdtfl="http://schemas.microsoft.com/office/word/2024/wordml/sdtformatlock" xmlns:w16se="http://schemas.microsoft.com/office/word/2015/wordml/symex" xmlns:wpg="http://schemas.microsoft.com/office/word/2010/wordprocessingGroup" xmlns:wpi="http://schemas.microsoft.com/office/word/2010/wordprocessingInk" xmlns:wne="http://schemas.microsoft.com/office/word/2006/wordml" xmlns:wps="http://schemas.microsoft.com/office/word/2010/wordprocessingShape" mc:Ignorable="w14 w15 w16se w16cid w16 w16cex w16sdtdh w16sdtfl w16du wp14">
   <w:body>
     <w:p>
       <w:pPr>
@@ -1614,6 +1614,613 @@
         </w:rPr>
       </w:pPr>
     </w:p>
+    <w:p>
+      <w:pPr>
+        <w:rPr>
+          <w:b/>
+          <w:bCs/>
+        </w:rPr>
+      </w:pPr>
+    </w:p>
+    <w:p>
+      <w:pPr>
+        <w:rPr>
+          <w:b/>
+          <w:bCs/>
+        </w:rPr>
+      </w:pPr>
+      <w:r>
+        <w:rPr>
+          <w:b/>
+          <w:bCs/>
+        </w:rPr>
+        <w:t>Standardization</w:t>
+      </w:r>
+      <w:r>
+        <w:rPr>
+          <w:b/>
+          <w:bCs/>
+        </w:rPr>
+        <w:t xml:space="preserve">: - </w:t>
+      </w:r>
+    </w:p>
+    <w:p>
+      <w:pPr>
+        <w:rPr>
+          <w:b/>
+          <w:bCs/>
+        </w:rPr>
+      </w:pPr>
+    </w:p>
+    <w:p>
+      <w:pPr>
+        <w:rPr>
+          <w:b/>
+          <w:bCs/>
+        </w:rPr>
+      </w:pPr>
+      <w:r>
+        <w:rPr>
+          <w:b/>
+          <w:bCs/>
+        </w:rPr>
+        <w:t>Discretization:</w:t>
+      </w:r>
+      <w:r>
+        <w:rPr>
+          <w:b/>
+          <w:bCs/>
+        </w:rPr>
+        <w:br/>
+        <w:t>Converts a continuous attribute into a finite set of intervals, each treated as a category or ordinal label.</w:t>
+      </w:r>
+    </w:p>
+    <w:p>
+      <w:pPr>
+        <w:rPr>
+          <w:b/>
+          <w:bCs/>
+        </w:rPr>
+      </w:pPr>
+      <w:r>
+        <w:rPr>
+          <w:b/>
+          <w:bCs/>
+        </w:rPr>
+        <w:t>Binning:</w:t>
+      </w:r>
+      <w:r>
+        <w:rPr>
+          <w:b/>
+          <w:bCs/>
+        </w:rPr>
+        <w:br/>
+        <w:t>Divides continuous data into intervals (bins). It can use equal-width bins (same interval size) or equal-frequency bins (approximately the same number of data points in each bin).</w:t>
+      </w:r>
+    </w:p>
+    <w:p>
+      <w:pPr>
+        <w:rPr>
+          <w:b/>
+          <w:bCs/>
+        </w:rPr>
+      </w:pPr>
+      <w:r>
+        <w:rPr>
+          <w:b/>
+          <w:bCs/>
+        </w:rPr>
+        <w:t>Histogram Analysis:</w:t>
+      </w:r>
+      <w:r>
+        <w:rPr>
+          <w:b/>
+          <w:bCs/>
+        </w:rPr>
+        <w:br/>
+        <w:t>Uses a histogram to examine the distribution of continuous data and identify natural ranges or boundaries for creating intervals.</w:t>
+      </w:r>
+    </w:p>
+    <w:p>
+      <w:pPr>
+        <w:rPr>
+          <w:b/>
+          <w:bCs/>
+        </w:rPr>
+      </w:pPr>
+      <w:r>
+        <w:rPr>
+          <w:b/>
+          <w:bCs/>
+        </w:rPr>
+        <w:t>Cluster Analysis:</w:t>
+      </w:r>
+      <w:r>
+        <w:rPr>
+          <w:b/>
+          <w:bCs/>
+        </w:rPr>
+        <w:br/>
+        <w:t>Groups similar data values into clusters. The boundaries between clusters can then be used to discretize the continuous attribute into meaningful intervals.</w:t>
+      </w:r>
+    </w:p>
+    <w:p>
+      <w:pPr>
+        <w:rPr>
+          <w:b/>
+          <w:bCs/>
+        </w:rPr>
+      </w:pPr>
+      <w:r>
+        <w:rPr>
+          <w:b/>
+          <w:bCs/>
+        </w:rPr>
+        <w:t>Entropy-based (Supervised):</w:t>
+      </w:r>
+      <w:r>
+        <w:rPr>
+          <w:b/>
+          <w:bCs/>
+        </w:rPr>
+        <w:br/>
+        <w:t>Uses class labels and entropy to determine the best split points for discretization. It selects intervals that make the resulting classes as homogeneous as possible, reducing uncertainty.</w:t>
+      </w:r>
+    </w:p>
+    <w:p>
+      <w:pPr>
+        <w:rPr>
+          <w:b/>
+          <w:bCs/>
+        </w:rPr>
+      </w:pPr>
+      <w:r>
+        <w:rPr>
+          <w:b/>
+          <w:bCs/>
+        </w:rPr>
+        <w:t>Uses of discretization / Advantages</w:t>
+      </w:r>
+      <w:r>
+        <w:rPr>
+          <w:b/>
+          <w:bCs/>
+        </w:rPr>
+        <w:t xml:space="preserve">: - </w:t>
+      </w:r>
+    </w:p>
+    <w:p>
+      <w:pPr>
+        <w:rPr>
+          <w:b/>
+          <w:bCs/>
+        </w:rPr>
+      </w:pPr>
+    </w:p>
+    <w:p>
+      <w:r>
+        <w:t>Bin width: - W = Max-Min/N</w:t>
+      </w:r>
+    </w:p>
+    <w:p>
+      <w:r>
+        <w:t xml:space="preserve"> </w:t>
+      </w:r>
+      <w:r>
+        <w:tab/>
+      </w:r>
+    </w:p>
+    <w:p>
+      <w:r>
+        <w:rPr>
+          <w:b/>
+          <w:bCs/>
+        </w:rPr>
+        <w:lastRenderedPageBreak/>
+        <w:t>Exploratory data Analysis</w:t>
+      </w:r>
+      <w:r>
+        <w:rPr>
+          <w:b/>
+          <w:bCs/>
+        </w:rPr>
+        <w:t>: -</w:t>
+      </w:r>
+      <w:r>
+        <w:t xml:space="preserve"> (EDA)</w:t>
+      </w:r>
+    </w:p>
+    <w:p>
+      <w:pPr>
+        <w:rPr>
+          <w:b/>
+          <w:bCs/>
+        </w:rPr>
+      </w:pPr>
+      <w:r>
+        <w:rPr>
+          <w:b/>
+          <w:bCs/>
+        </w:rPr>
+        <w:t>Data quality -&gt; Feature selection and engineering</w:t>
+      </w:r>
+      <w:r>
+        <w:rPr>
+          <w:b/>
+          <w:bCs/>
+        </w:rPr>
+        <w:t xml:space="preserve"> -&gt; Model selection -&gt; Data visualization</w:t>
+      </w:r>
+      <w:r>
+        <w:rPr>
+          <w:b/>
+          <w:bCs/>
+        </w:rPr>
+        <w:t xml:space="preserve"> -&gt; Anomaly detection.</w:t>
+      </w:r>
+    </w:p>
+    <w:p>
+      <w:pPr>
+        <w:rPr>
+          <w:b/>
+          <w:bCs/>
+        </w:rPr>
+      </w:pPr>
+    </w:p>
+    <w:p>
+      <w:pPr>
+        <w:rPr>
+          <w:b/>
+          <w:bCs/>
+        </w:rPr>
+      </w:pPr>
+      <w:r>
+        <w:rPr>
+          <w:b/>
+          <w:bCs/>
+        </w:rPr>
+        <w:t>Eda: - Univariate, Bivariate, Multivariate.</w:t>
+      </w:r>
+    </w:p>
+    <w:p>
+      <w:pPr>
+        <w:rPr>
+          <w:b/>
+          <w:bCs/>
+        </w:rPr>
+      </w:pPr>
+      <w:r>
+        <w:rPr>
+          <w:b/>
+          <w:bCs/>
+        </w:rPr>
+        <w:t xml:space="preserve"> </w:t>
+      </w:r>
+    </w:p>
+    <w:p>
+      <w:pPr>
+        <w:rPr>
+          <w:b/>
+          <w:bCs/>
+        </w:rPr>
+      </w:pPr>
+    </w:p>
+    <w:p>
+      <w:pPr>
+        <w:rPr>
+          <w:b/>
+          <w:bCs/>
+        </w:rPr>
+      </w:pPr>
+    </w:p>
+    <w:p>
+      <w:pPr>
+        <w:rPr>
+          <w:b/>
+          <w:bCs/>
+        </w:rPr>
+      </w:pPr>
+    </w:p>
+    <w:p>
+      <w:pPr>
+        <w:rPr>
+          <w:b/>
+          <w:bCs/>
+        </w:rPr>
+      </w:pPr>
+    </w:p>
+    <w:p>
+      <w:pPr>
+        <w:rPr>
+          <w:b/>
+          <w:bCs/>
+        </w:rPr>
+      </w:pPr>
+    </w:p>
+    <w:p>
+      <w:pPr>
+        <w:rPr>
+          <w:b/>
+          <w:bCs/>
+        </w:rPr>
+      </w:pPr>
+    </w:p>
+    <w:p>
+      <w:pPr>
+        <w:rPr>
+          <w:b/>
+          <w:bCs/>
+        </w:rPr>
+      </w:pPr>
+    </w:p>
+    <w:p>
+      <w:pPr>
+        <w:rPr>
+          <w:b/>
+          <w:bCs/>
+        </w:rPr>
+      </w:pPr>
+    </w:p>
+    <w:p>
+      <w:pPr>
+        <w:rPr>
+          <w:b/>
+          <w:bCs/>
+        </w:rPr>
+      </w:pPr>
+    </w:p>
+    <w:p>
+      <w:pPr>
+        <w:rPr>
+          <w:b/>
+          <w:bCs/>
+        </w:rPr>
+      </w:pPr>
+    </w:p>
+    <w:p>
+      <w:pPr>
+        <w:rPr>
+          <w:b/>
+          <w:bCs/>
+        </w:rPr>
+      </w:pPr>
+    </w:p>
+    <w:p>
+      <w:pPr>
+        <w:rPr>
+          <w:b/>
+          <w:bCs/>
+        </w:rPr>
+      </w:pPr>
+    </w:p>
+    <w:p>
+      <w:pPr>
+        <w:rPr>
+          <w:b/>
+          <w:bCs/>
+        </w:rPr>
+      </w:pPr>
+    </w:p>
+    <w:p>
+      <w:pPr>
+        <w:rPr>
+          <w:b/>
+          <w:bCs/>
+        </w:rPr>
+      </w:pPr>
+    </w:p>
+    <w:p>
+      <w:pPr>
+        <w:rPr>
+          <w:b/>
+          <w:bCs/>
+        </w:rPr>
+      </w:pPr>
+    </w:p>
+    <w:p>
+      <w:pPr>
+        <w:rPr>
+          <w:b/>
+          <w:bCs/>
+        </w:rPr>
+      </w:pPr>
+    </w:p>
+    <w:p>
+      <w:pPr>
+        <w:rPr>
+          <w:b/>
+          <w:bCs/>
+        </w:rPr>
+      </w:pPr>
+    </w:p>
+    <w:p>
+      <w:pPr>
+        <w:rPr>
+          <w:b/>
+          <w:bCs/>
+        </w:rPr>
+      </w:pPr>
+    </w:p>
+    <w:p>
+      <w:pPr>
+        <w:rPr>
+          <w:b/>
+          <w:bCs/>
+        </w:rPr>
+      </w:pPr>
+    </w:p>
+    <w:p>
+      <w:pPr>
+        <w:rPr>
+          <w:b/>
+          <w:bCs/>
+        </w:rPr>
+      </w:pPr>
+    </w:p>
+    <w:p>
+      <w:r>
+        <w:rPr>
+          <w:b/>
+          <w:bCs/>
+        </w:rPr>
+        <w:lastRenderedPageBreak/>
+        <w:t>Measure of dispersion</w:t>
+      </w:r>
+      <w:r>
+        <w:t xml:space="preserve">: it refers to the degree to which </w:t>
+      </w:r>
+      <w:r>
+        <w:t>data values in a dataset are spread out or scattered around an average (such</w:t>
+      </w:r>
+      <w:r>
+        <w:t xml:space="preserve"> as the mean or media</w:t>
+      </w:r>
+      <w:r>
+        <w:t>)</w:t>
+      </w:r>
+      <w:r>
+        <w:t>. It helps us understand the variability or consistency within the data -</w:t>
+      </w:r>
+      <w:r>
+        <w:t xml:space="preserve"> whether the values are closely grouped </w:t>
+      </w:r>
+      <w:r>
+        <w:t>or widely spread.</w:t>
+      </w:r>
+    </w:p>
+    <w:p/>
+    <w:p>
+      <w:r>
+        <w:rPr>
+          <w:noProof/>
+        </w:rPr>
+        <w:drawing>
+          <wp:inline distT="0" distB="0" distL="0" distR="0" wp14:anchorId="4E7DAD85" wp14:editId="7DC09C1C">
+            <wp:extent cx="3231515" cy="3742055"/>
+            <wp:effectExtent l="0" t="0" r="6985" b="0"/>
+            <wp:docPr id="484552197" name="Picture 1" descr="Medium"/>
+            <wp:cNvGraphicFramePr>
+              <a:graphicFrameLocks xmlns:a="http://schemas.openxmlformats.org/drawingml/2006/main" noChangeAspect="1"/>
+            </wp:cNvGraphicFramePr>
+            <a:graphic xmlns:a="http://schemas.openxmlformats.org/drawingml/2006/main">
+              <a:graphicData uri="http://schemas.openxmlformats.org/drawingml/2006/picture">
+                <pic:pic xmlns:pic="http://schemas.openxmlformats.org/drawingml/2006/picture">
+                  <pic:nvPicPr>
+                    <pic:cNvPr id="0" name="Picture 1" descr="Medium"/>
+                    <pic:cNvPicPr>
+                      <a:picLocks noChangeAspect="1" noChangeArrowheads="1"/>
+                    </pic:cNvPicPr>
+                  </pic:nvPicPr>
+                  <pic:blipFill>
+                    <a:blip r:embed="rId8">
+                      <a:extLst>
+                        <a:ext uri="{28A0092B-C50C-407E-A947-70E740481C1C}">
+                          <a14:useLocalDpi xmlns:a14="http://schemas.microsoft.com/office/drawing/2010/main" val="0"/>
+                        </a:ext>
+                      </a:extLst>
+                    </a:blip>
+                    <a:srcRect/>
+                    <a:stretch>
+                      <a:fillRect/>
+                    </a:stretch>
+                  </pic:blipFill>
+                  <pic:spPr bwMode="auto">
+                    <a:xfrm>
+                      <a:off x="0" y="0"/>
+                      <a:ext cx="3231515" cy="3742055"/>
+                    </a:xfrm>
+                    <a:prstGeom prst="rect">
+                      <a:avLst/>
+                    </a:prstGeom>
+                    <a:noFill/>
+                    <a:ln>
+                      <a:noFill/>
+                    </a:ln>
+                  </pic:spPr>
+                </pic:pic>
+              </a:graphicData>
+            </a:graphic>
+          </wp:inline>
+        </w:drawing>
+      </w:r>
+    </w:p>
+    <w:p/>
+    <w:p/>
+    <w:p/>
+    <w:p>
+      <w:r>
+        <w:rPr>
+          <w:b/>
+          <w:bCs/>
+        </w:rPr>
+        <w:t xml:space="preserve">Absolute Measure of </w:t>
+      </w:r>
+      <w:r>
+        <w:rPr>
+          <w:b/>
+          <w:bCs/>
+        </w:rPr>
+        <w:t>D</w:t>
+      </w:r>
+      <w:r>
+        <w:rPr>
+          <w:b/>
+          <w:bCs/>
+        </w:rPr>
+        <w:t>ispersion</w:t>
+      </w:r>
+      <w:r>
+        <w:t>: - Range, Mean Deviation, Standard Deviation, Variance, Quartile Deviation, Interquartile Range</w:t>
+      </w:r>
+    </w:p>
+    <w:p/>
+    <w:p>
+      <w:r>
+        <w:rPr>
+          <w:b/>
+          <w:bCs/>
+        </w:rPr>
+        <w:t>Relative Measure of Dispersion</w:t>
+      </w:r>
+      <w:r>
+        <w:t>: - Coefficient of Range, Coefficient of Variation, Coefficient of Mean Deviation, Coefficient of Quartile Deviation</w:t>
+      </w:r>
+    </w:p>
+    <w:p/>
+    <w:p/>
+    <w:p>
+      <w:pPr>
+        <w:rPr>
+          <w:b/>
+          <w:bCs/>
+        </w:rPr>
+      </w:pPr>
+      <w:r>
+        <w:rPr>
+          <w:b/>
+          <w:bCs/>
+        </w:rPr>
+        <w:lastRenderedPageBreak/>
+        <w:t>Feature Selection</w:t>
+      </w:r>
+    </w:p>
+    <w:p>
+      <w:r>
+        <w:rPr>
+          <w:b/>
+          <w:bCs/>
+        </w:rPr>
+        <w:t xml:space="preserve">Random forest: - </w:t>
+      </w:r>
+      <w:r>
+        <w:br/>
+        <w:t>Techniques, Advantages, Limitations.</w:t>
+      </w:r>
+      <w:r>
+        <w:br/>
+        <w:t>Applicability of feature selection</w:t>
+      </w:r>
+    </w:p>
     <w:sectPr>
       <w:pgSz w:w="12240" w:h="15840"/>
       <w:pgMar w:top="1440" w:right="1440" w:bottom="1440" w:left="1440" w:header="720" w:footer="720" w:gutter="0"/>
@@ -1625,7 +2232,7 @@
 </file>
 
 <file path=word/numbering.xml><?xml version="1.0" encoding="utf-8"?>
-<w:numbering xmlns:wpc="http://schemas.microsoft.com/office/word/2010/wordprocessingCanvas" xmlns:cx="http://schemas.microsoft.com/office/drawing/2014/chartex" xmlns:cx1="http://schemas.microsoft.com/office/drawing/2015/9/8/chartex" xmlns:cx2="http://schemas.microsoft.com/office/drawing/2015/10/21/chartex" xmlns:cx3="http://schemas.microsoft.com/office/drawing/2016/5/9/chartex" xmlns:cx4="http://schemas.microsoft.com/office/drawing/2016/5/10/chartex" xmlns:cx5="http://schemas.microsoft.com/office/drawing/2016/5/11/chartex" xmlns:cx6="http://schemas.microsoft.com/office/drawing/2016/5/12/chartex" xmlns:cx7="http://schemas.microsoft.com/office/drawing/2016/5/13/chartex" xmlns:cx8="http://schemas.microsoft.com/office/drawing/2016/5/14/chartex" xmlns:mc="http://schemas.openxmlformats.org/markup-compatibility/2006" xmlns:aink="http://schemas.microsoft.com/office/drawing/2016/ink" xmlns:am3d="http://schemas.microsoft.com/office/drawing/2017/model3d" xmlns:o="urn:schemas-microsoft-com:office:office" xmlns:oel="http://schemas.microsoft.com/office/2019/extlst" xmlns:r="http://schemas.openxmlformats.org/officeDocument/2006/relationships" xmlns:m="http://schemas.openxmlformats.org/officeDocument/2006/math" xmlns:v="urn:schemas-microsoft-com:vml" xmlns:wp14="http://schemas.microsoft.com/office/word/2010/wordprocessingDrawing" xmlns:wp="http://schemas.openxmlformats.org/drawingml/2006/wordprocessingDrawing" xmlns:w10="urn:schemas-microsoft-com:office:word" xmlns:w="http://schemas.openxmlformats.org/wordprocessingml/2006/main" xmlns:w14="http://schemas.microsoft.com/office/word/2010/wordml" xmlns:w15="http://schemas.microsoft.com/office/word/2012/wordml" xmlns:w16cei="http://schemas.microsoft.com/office/word/2026/wordml/cei" xmlns:w16cex="http://schemas.microsoft.com/office/word/2018/wordml/cex" xmlns:w16cid="http://schemas.microsoft.com/office/word/2016/wordml/cid" xmlns:w16="http://schemas.microsoft.com/office/word/2018/wordml" xmlns:w16du="http://schemas.microsoft.com/office/word/2023/wordml/word16du" xmlns:w16sdtdh="http://schemas.microsoft.com/office/word/2020/wordml/sdtdatahash" xmlns:w16sdtfl="http://schemas.microsoft.com/office/word/2024/wordml/sdtformatlock" xmlns:w16se="http://schemas.microsoft.com/office/word/2015/wordml/symex" xmlns:wpg="http://schemas.microsoft.com/office/word/2010/wordprocessingGroup" xmlns:wpi="http://schemas.microsoft.com/office/word/2010/wordprocessingInk" xmlns:wne="http://schemas.microsoft.com/office/word/2006/wordml" xmlns:wps="http://schemas.microsoft.com/office/word/2010/wordprocessingShape" mc:Ignorable="w14 w15 w16se w16cid w16 w16cex w16sdtdh w16sdtfl w16du wp14">
+<w:numbering xmlns:wpc="http://schemas.microsoft.com/office/word/2010/wordprocessingCanvas" xmlns:cx="http://schemas.microsoft.com/office/drawing/2014/chartex" xmlns:cx1="http://schemas.microsoft.com/office/drawing/2015/9/8/chartex" xmlns:cx2="http://schemas.microsoft.com/office/drawing/2015/10/21/chartex" xmlns:cx3="http://schemas.microsoft.com/office/drawing/2016/5/9/chartex" xmlns:cx4="http://schemas.microsoft.com/office/drawing/2016/5/10/chartex" xmlns:cx5="http://schemas.microsoft.com/office/drawing/2016/5/11/chartex" xmlns:cx6="http://schemas.microsoft.com/office/drawing/2016/5/12/chartex" xmlns:cx7="http://schemas.microsoft.com/office/drawing/2016/5/13/chartex" xmlns:cx8="http://schemas.microsoft.com/office/drawing/2016/5/14/chartex" xmlns:mc="http://schemas.openxmlformats.org/markup-compatibility/2006" xmlns:aink="http://schemas.microsoft.com/office/drawing/2016/ink" xmlns:am3d="http://schemas.microsoft.com/office/drawing/2017/model3d" xmlns:o="urn:schemas-microsoft-com:office:office" xmlns:oel="http://schemas.microsoft.com/office/2019/extlst" xmlns:r="http://schemas.openxmlformats.org/officeDocument/2006/relationships" xmlns:m="http://schemas.openxmlformats.org/officeDocument/2006/math" xmlns:v="urn:schemas-microsoft-com:vml" xmlns:wp14="http://schemas.microsoft.com/office/word/2010/wordprocessingDrawing" xmlns:wp="http://schemas.openxmlformats.org/drawingml/2006/wordprocessingDrawing" xmlns:w10="urn:schemas-microsoft-com:office:word" xmlns:w="http://schemas.openxmlformats.org/wordprocessingml/2006/main" xmlns:w14="http://schemas.microsoft.com/office/word/2010/wordml" xmlns:w15="http://schemas.microsoft.com/office/word/2012/wordml" xmlns:w16cex="http://schemas.microsoft.com/office/word/2018/wordml/cex" xmlns:w16cid="http://schemas.microsoft.com/office/word/2016/wordml/cid" xmlns:w16="http://schemas.microsoft.com/office/word/2018/wordml" xmlns:w16du="http://schemas.microsoft.com/office/word/2023/wordml/word16du" xmlns:w16sdtdh="http://schemas.microsoft.com/office/word/2020/wordml/sdtdatahash" xmlns:w16sdtfl="http://schemas.microsoft.com/office/word/2024/wordml/sdtformatlock" xmlns:w16se="http://schemas.microsoft.com/office/word/2015/wordml/symex" xmlns:wpg="http://schemas.microsoft.com/office/word/2010/wordprocessingGroup" xmlns:wpi="http://schemas.microsoft.com/office/word/2010/wordprocessingInk" xmlns:wne="http://schemas.microsoft.com/office/word/2006/wordml" xmlns:wps="http://schemas.microsoft.com/office/word/2010/wordprocessingShape" mc:Ignorable="w14 w15 w16se w16cid w16 w16cex w16sdtdh w16sdtfl w16du wp14">
   <w:abstractNum w:abstractNumId="0" w15:restartNumberingAfterBreak="0">
     <w:nsid w:val="06B04DB8"/>
     <w:multiLevelType w:val="multilevel"/>

</xml_diff>